<commit_message>
docs(examples): regenerate the visualize guide with the current CLI (4)
Co-Authored-By: Claude Opus 5.5 <noreply@anthropic.com>
Claude-Session: https://claude.ai/code/session_011bYN5QY25n4bVER1Pv4xvv
</commit_message>
<xml_diff>
--- a/examples/cli/visualize/out/from-markdown.docx
+++ b/examples/cli/visualize/out/from-markdown.docx
@@ -161,7 +161,6 @@
     </w:p>
     <w:tbl>
       <w:tblPr>
-        <w:tblStyle w:val="TableGrid"/>
         <w:tblW w:w="5000" w:type="pct"/>
         <w:tblLook w:val="04A0" w:firstRow="1" w:lastRow="0" w:firstColumn="1" w:lastColumn="0" w:noHBand="0" w:noVBand="1"/>
       </w:tblPr>
@@ -455,24 +454,6 @@
   <w:style w:type="paragraph" w:default="1" w:styleId="Normal">
     <w:name w:val="Normal"/>
     <w:qFormat/>
-  </w:style>
-  <w:style w:type="table" w:styleId="TableGrid">
-    <w:name w:val="Table Grid"/>
-    <w:basedOn w:val="TableNormal"/>
-    <w:uiPriority w:val="39"/>
-    <w:pPr>
-      <w:spacing w:after="0" w:line="240" w:lineRule="auto"/>
-    </w:pPr>
-    <w:tblPr>
-      <w:tblBorders>
-        <w:top w:val="single" w:sz="4" w:space="0" w:color="auto"/>
-        <w:left w:val="single" w:sz="4" w:space="0" w:color="auto"/>
-        <w:bottom w:val="single" w:sz="4" w:space="0" w:color="auto"/>
-        <w:right w:val="single" w:sz="4" w:space="0" w:color="auto"/>
-        <w:insideH w:val="single" w:sz="4" w:space="0" w:color="auto"/>
-        <w:insideV w:val="single" w:sz="4" w:space="0" w:color="auto"/>
-      </w:tblBorders>
-    </w:tblPr>
   </w:style>
   <w:style w:type="table" w:default="1" w:styleId="TableNormal">
     <w:name w:val="Normal Table"/>

</xml_diff>